<commit_message>
fix: Carbone template tags — {c.} → {d.} (Carbone v3 syntax)
Carbone v3 uses {d.field} not {c.field} for data access.
All templates regenerated with correct tag prefix.
Brochure, CMA, and Comparison templates now properly
render AI-generated JSON data.
</commit_message>
<xml_diff>
--- a/ai-server/templates/brochure.docx
+++ b/ai-server/templates/brochure.docx
@@ -15,7 +15,7 @@
           <w:sz w:val="44"/>
           <w:szCs w:val="44"/>
         </w:rPr>
-        <w:t xml:space="preserve">{c.property_name}</w:t>
+        <w:t xml:space="preserve">{d.property_name}</w:t>
       </w:r>
     </w:p>
     <w:p>
@@ -40,7 +40,7 @@
           <w:sz w:val="20"/>
           <w:szCs w:val="20"/>
         </w:rPr>
-        <w:t xml:space="preserve">{c.tone}</w:t>
+        <w:t xml:space="preserve">{d.tone}</w:t>
       </w:r>
     </w:p>
     <w:p>
@@ -78,7 +78,7 @@
           <w:sz w:val="22"/>
           <w:szCs w:val="22"/>
         </w:rPr>
-        <w:t xml:space="preserve">{c.details}</w:t>
+        <w:t xml:space="preserve">{d.details}</w:t>
       </w:r>
     </w:p>
     <w:p>
@@ -183,7 +183,7 @@
         <w:sz w:val="18"/>
         <w:szCs w:val="18"/>
       </w:rPr>
-      <w:t xml:space="preserve">{c.generated_date}</w:t>
+      <w:t xml:space="preserve">{d.generated_date}</w:t>
     </w:r>
     <w:r>
       <w:rPr>

</xml_diff>